<commit_message>
Added Q2, Q3 and Started Part Two
</commit_message>
<xml_diff>
--- a/outputs/dart_lab-group2.docx
+++ b/outputs/dart_lab-group2.docx
@@ -12,6 +12,9 @@
     </w:p>
     <w:p>
       <w:r>
+        <w:rPr>
+          <w:noProof/>
+        </w:rPr>
         <w:drawing>
           <wp:inline distT="0" distB="0" distL="0" distR="0" wp14:anchorId="663AF08A" wp14:editId="13A9D149">
             <wp:extent cx="5731510" cy="2577465"/>
@@ -50,6 +53,116 @@
       </w:r>
     </w:p>
     <w:p/>
+    <w:p>
+      <w:r>
+        <w:t>Q</w:t>
+      </w:r>
+      <w:r>
+        <w:t>2</w:t>
+      </w:r>
+      <w:r>
+        <w:t xml:space="preserve">: </w:t>
+      </w:r>
+      <w:r>
+        <w:t>Output</w:t>
+      </w:r>
+    </w:p>
+    <w:p>
+      <w:r>
+        <w:rPr>
+          <w:noProof/>
+        </w:rPr>
+        <w:drawing>
+          <wp:inline distT="0" distB="0" distL="0" distR="0" wp14:anchorId="432C1CAB" wp14:editId="06D399F3">
+            <wp:extent cx="5731510" cy="2399030"/>
+            <wp:effectExtent l="0" t="0" r="2540" b="1270"/>
+            <wp:docPr id="338067257" name="Picture 1"/>
+            <wp:cNvGraphicFramePr>
+              <a:graphicFrameLocks xmlns:a="http://schemas.openxmlformats.org/drawingml/2006/main" noChangeAspect="1"/>
+            </wp:cNvGraphicFramePr>
+            <a:graphic xmlns:a="http://schemas.openxmlformats.org/drawingml/2006/main">
+              <a:graphicData uri="http://schemas.openxmlformats.org/drawingml/2006/picture">
+                <pic:pic xmlns:pic="http://schemas.openxmlformats.org/drawingml/2006/picture">
+                  <pic:nvPicPr>
+                    <pic:cNvPr id="338067257" name=""/>
+                    <pic:cNvPicPr/>
+                  </pic:nvPicPr>
+                  <pic:blipFill>
+                    <a:blip r:embed="rId5"/>
+                    <a:stretch>
+                      <a:fillRect/>
+                    </a:stretch>
+                  </pic:blipFill>
+                  <pic:spPr>
+                    <a:xfrm>
+                      <a:off x="0" y="0"/>
+                      <a:ext cx="5731510" cy="2399030"/>
+                    </a:xfrm>
+                    <a:prstGeom prst="rect">
+                      <a:avLst/>
+                    </a:prstGeom>
+                  </pic:spPr>
+                </pic:pic>
+              </a:graphicData>
+            </a:graphic>
+          </wp:inline>
+        </w:drawing>
+      </w:r>
+    </w:p>
+    <w:p>
+      <w:r>
+        <w:t>Q</w:t>
+      </w:r>
+      <w:r>
+        <w:t>3</w:t>
+      </w:r>
+      <w:r>
+        <w:t>: Output</w:t>
+      </w:r>
+    </w:p>
+    <w:p>
+      <w:r>
+        <w:rPr>
+          <w:noProof/>
+        </w:rPr>
+        <w:lastRenderedPageBreak/>
+        <w:drawing>
+          <wp:inline distT="0" distB="0" distL="0" distR="0" wp14:anchorId="5A4DC6BD" wp14:editId="167E3389">
+            <wp:extent cx="5731510" cy="2447925"/>
+            <wp:effectExtent l="0" t="0" r="2540" b="9525"/>
+            <wp:docPr id="902611451" name="Picture 1"/>
+            <wp:cNvGraphicFramePr>
+              <a:graphicFrameLocks xmlns:a="http://schemas.openxmlformats.org/drawingml/2006/main" noChangeAspect="1"/>
+            </wp:cNvGraphicFramePr>
+            <a:graphic xmlns:a="http://schemas.openxmlformats.org/drawingml/2006/main">
+              <a:graphicData uri="http://schemas.openxmlformats.org/drawingml/2006/picture">
+                <pic:pic xmlns:pic="http://schemas.openxmlformats.org/drawingml/2006/picture">
+                  <pic:nvPicPr>
+                    <pic:cNvPr id="902611451" name=""/>
+                    <pic:cNvPicPr/>
+                  </pic:nvPicPr>
+                  <pic:blipFill>
+                    <a:blip r:embed="rId6"/>
+                    <a:stretch>
+                      <a:fillRect/>
+                    </a:stretch>
+                  </pic:blipFill>
+                  <pic:spPr>
+                    <a:xfrm>
+                      <a:off x="0" y="0"/>
+                      <a:ext cx="5731510" cy="2447925"/>
+                    </a:xfrm>
+                    <a:prstGeom prst="rect">
+                      <a:avLst/>
+                    </a:prstGeom>
+                  </pic:spPr>
+                </pic:pic>
+              </a:graphicData>
+            </a:graphic>
+          </wp:inline>
+        </w:drawing>
+      </w:r>
+    </w:p>
     <w:p/>
     <w:sectPr>
       <w:pgSz w:w="11906" w:h="16838"/>
@@ -461,6 +574,7 @@
   <w:style w:type="paragraph" w:default="1" w:styleId="Normal">
     <w:name w:val="Normal"/>
     <w:qFormat/>
+    <w:rsid w:val="00E96065"/>
   </w:style>
   <w:style w:type="paragraph" w:styleId="Heading1">
     <w:name w:val="heading 1"/>

</xml_diff>

<commit_message>
Added quite some questions and modified some to ensure clarity
</commit_message>
<xml_diff>
--- a/outputs/dart_lab-group2.docx
+++ b/outputs/dart_lab-group2.docx
@@ -119,13 +119,56 @@
       <w:r>
         <w:t>: Output</w:t>
       </w:r>
+      <w:r>
+        <w:br/>
+      </w:r>
+      <w:r>
+        <w:drawing>
+          <wp:inline distT="0" distB="0" distL="0" distR="0" wp14:anchorId="20347089" wp14:editId="1390B76E">
+            <wp:extent cx="5731510" cy="2402840"/>
+            <wp:effectExtent l="0" t="0" r="2540" b="0"/>
+            <wp:docPr id="1772633325" name="Picture 1"/>
+            <wp:cNvGraphicFramePr>
+              <a:graphicFrameLocks xmlns:a="http://schemas.openxmlformats.org/drawingml/2006/main" noChangeAspect="1"/>
+            </wp:cNvGraphicFramePr>
+            <a:graphic xmlns:a="http://schemas.openxmlformats.org/drawingml/2006/main">
+              <a:graphicData uri="http://schemas.openxmlformats.org/drawingml/2006/picture">
+                <pic:pic xmlns:pic="http://schemas.openxmlformats.org/drawingml/2006/picture">
+                  <pic:nvPicPr>
+                    <pic:cNvPr id="1772633325" name=""/>
+                    <pic:cNvPicPr/>
+                  </pic:nvPicPr>
+                  <pic:blipFill>
+                    <a:blip r:embed="rId6"/>
+                    <a:stretch>
+                      <a:fillRect/>
+                    </a:stretch>
+                  </pic:blipFill>
+                  <pic:spPr>
+                    <a:xfrm>
+                      <a:off x="0" y="0"/>
+                      <a:ext cx="5731510" cy="2402840"/>
+                    </a:xfrm>
+                    <a:prstGeom prst="rect">
+                      <a:avLst/>
+                    </a:prstGeom>
+                  </pic:spPr>
+                </pic:pic>
+              </a:graphicData>
+            </a:graphic>
+          </wp:inline>
+        </w:drawing>
+      </w:r>
     </w:p>
     <w:p>
+      <w:r>
+        <w:lastRenderedPageBreak/>
+        <w:t>Q4&amp;5: Output</w:t>
+      </w:r>
       <w:r>
         <w:rPr>
           <w:noProof/>
         </w:rPr>
-        <w:lastRenderedPageBreak/>
         <w:drawing>
           <wp:inline distT="0" distB="0" distL="0" distR="0" wp14:anchorId="5A4DC6BD" wp14:editId="167E3389">
             <wp:extent cx="5731510" cy="2447925"/>
@@ -142,7 +185,7 @@
                     <pic:cNvPicPr/>
                   </pic:nvPicPr>
                   <pic:blipFill>
-                    <a:blip r:embed="rId6"/>
+                    <a:blip r:embed="rId7"/>
                     <a:stretch>
                       <a:fillRect/>
                     </a:stretch>
@@ -151,6 +194,102 @@
                     <a:xfrm>
                       <a:off x="0" y="0"/>
                       <a:ext cx="5731510" cy="2447925"/>
+                    </a:xfrm>
+                    <a:prstGeom prst="rect">
+                      <a:avLst/>
+                    </a:prstGeom>
+                  </pic:spPr>
+                </pic:pic>
+              </a:graphicData>
+            </a:graphic>
+          </wp:inline>
+        </w:drawing>
+      </w:r>
+    </w:p>
+    <w:p>
+      <w:r>
+        <w:t>Q6: Output</w:t>
+      </w:r>
+      <w:r>
+        <w:drawing>
+          <wp:inline distT="0" distB="0" distL="0" distR="0" wp14:anchorId="0B3097D0" wp14:editId="0A63ED95">
+            <wp:extent cx="5731510" cy="2408555"/>
+            <wp:effectExtent l="0" t="0" r="2540" b="0"/>
+            <wp:docPr id="1610254440" name="Picture 1"/>
+            <wp:cNvGraphicFramePr>
+              <a:graphicFrameLocks xmlns:a="http://schemas.openxmlformats.org/drawingml/2006/main" noChangeAspect="1"/>
+            </wp:cNvGraphicFramePr>
+            <a:graphic xmlns:a="http://schemas.openxmlformats.org/drawingml/2006/main">
+              <a:graphicData uri="http://schemas.openxmlformats.org/drawingml/2006/picture">
+                <pic:pic xmlns:pic="http://schemas.openxmlformats.org/drawingml/2006/picture">
+                  <pic:nvPicPr>
+                    <pic:cNvPr id="1610254440" name=""/>
+                    <pic:cNvPicPr/>
+                  </pic:nvPicPr>
+                  <pic:blipFill>
+                    <a:blip r:embed="rId8"/>
+                    <a:stretch>
+                      <a:fillRect/>
+                    </a:stretch>
+                  </pic:blipFill>
+                  <pic:spPr>
+                    <a:xfrm>
+                      <a:off x="0" y="0"/>
+                      <a:ext cx="5731510" cy="2408555"/>
+                    </a:xfrm>
+                    <a:prstGeom prst="rect">
+                      <a:avLst/>
+                    </a:prstGeom>
+                  </pic:spPr>
+                </pic:pic>
+              </a:graphicData>
+            </a:graphic>
+          </wp:inline>
+        </w:drawing>
+      </w:r>
+    </w:p>
+    <w:p>
+      <w:r>
+        <w:t>Q</w:t>
+      </w:r>
+      <w:r>
+        <w:t>7</w:t>
+      </w:r>
+      <w:r>
+        <w:t>: Output</w:t>
+      </w:r>
+      <w:r>
+        <w:rPr>
+          <w:noProof/>
+        </w:rPr>
+        <w:t xml:space="preserve"> </w:t>
+      </w:r>
+      <w:r>
+        <w:drawing>
+          <wp:inline distT="0" distB="0" distL="0" distR="0" wp14:anchorId="3515F4B5" wp14:editId="34412F82">
+            <wp:extent cx="5731510" cy="2350770"/>
+            <wp:effectExtent l="0" t="0" r="2540" b="0"/>
+            <wp:docPr id="1388844723" name="Picture 1"/>
+            <wp:cNvGraphicFramePr>
+              <a:graphicFrameLocks xmlns:a="http://schemas.openxmlformats.org/drawingml/2006/main" noChangeAspect="1"/>
+            </wp:cNvGraphicFramePr>
+            <a:graphic xmlns:a="http://schemas.openxmlformats.org/drawingml/2006/main">
+              <a:graphicData uri="http://schemas.openxmlformats.org/drawingml/2006/picture">
+                <pic:pic xmlns:pic="http://schemas.openxmlformats.org/drawingml/2006/picture">
+                  <pic:nvPicPr>
+                    <pic:cNvPr id="1388844723" name=""/>
+                    <pic:cNvPicPr/>
+                  </pic:nvPicPr>
+                  <pic:blipFill>
+                    <a:blip r:embed="rId9"/>
+                    <a:stretch>
+                      <a:fillRect/>
+                    </a:stretch>
+                  </pic:blipFill>
+                  <pic:spPr>
+                    <a:xfrm>
+                      <a:off x="0" y="0"/>
+                      <a:ext cx="5731510" cy="2350770"/>
                     </a:xfrm>
                     <a:prstGeom prst="rect">
                       <a:avLst/>
@@ -778,6 +917,7 @@
   <w:style w:type="character" w:default="1" w:styleId="DefaultParagraphFont">
     <w:name w:val="Default Paragraph Font"/>
     <w:uiPriority w:val="1"/>
+    <w:semiHidden/>
     <w:unhideWhenUsed/>
   </w:style>
   <w:style w:type="table" w:default="1" w:styleId="TableNormal">

</xml_diff>

<commit_message>
The outputs and their descriptions
</commit_message>
<xml_diff>
--- a/outputs/dart_lab-group2.docx
+++ b/outputs/dart_lab-group2.docx
@@ -50,7 +50,7 @@
                     <pic:cNvPicPr/>
                   </pic:nvPicPr>
                   <pic:blipFill>
-                    <a:blip r:embed="rId5"/>
+                    <a:blip r:embed="rId6"/>
                     <a:stretch>
                       <a:fillRect/>
                     </a:stretch>
@@ -71,6 +71,18 @@
         </w:drawing>
       </w:r>
     </w:p>
+    <w:p>
+      <w:pPr>
+        <w:pStyle w:val="ListParagraph"/>
+        <w:numPr>
+          <w:ilvl w:val="0"/>
+          <w:numId w:val="1"/>
+        </w:numPr>
+      </w:pPr>
+      <w:r>
+        <w:t>Prints a welcome message for the school system.</w:t>
+      </w:r>
+    </w:p>
     <w:p/>
     <w:p>
       <w:r>
@@ -107,7 +119,7 @@
                     <pic:cNvPicPr/>
                   </pic:nvPicPr>
                   <pic:blipFill>
-                    <a:blip r:embed="rId6"/>
+                    <a:blip r:embed="rId7"/>
                     <a:stretch>
                       <a:fillRect/>
                     </a:stretch>
@@ -129,6 +141,18 @@
       </w:r>
     </w:p>
     <w:p>
+      <w:pPr>
+        <w:pStyle w:val="ListParagraph"/>
+        <w:numPr>
+          <w:ilvl w:val="0"/>
+          <w:numId w:val="1"/>
+        </w:numPr>
+      </w:pPr>
+      <w:r>
+        <w:t>Displays student name and age using named parameters.</w:t>
+      </w:r>
+    </w:p>
+    <w:p>
       <w:r>
         <w:lastRenderedPageBreak/>
         <w:t>Q</w:t>
@@ -162,7 +186,7 @@
                     <pic:cNvPicPr/>
                   </pic:nvPicPr>
                   <pic:blipFill>
-                    <a:blip r:embed="rId7"/>
+                    <a:blip r:embed="rId8"/>
                     <a:stretch>
                       <a:fillRect/>
                     </a:stretch>
@@ -184,6 +208,23 @@
       </w:r>
     </w:p>
     <w:p>
+      <w:pPr>
+        <w:pStyle w:val="ListParagraph"/>
+        <w:numPr>
+          <w:ilvl w:val="0"/>
+          <w:numId w:val="1"/>
+        </w:numPr>
+      </w:pPr>
+      <w:r>
+        <w:t>Prints teacher details and handles missing subject information.</w:t>
+      </w:r>
+    </w:p>
+    <w:p>
+      <w:pPr>
+        <w:pStyle w:val="ListParagraph"/>
+      </w:pPr>
+    </w:p>
+    <w:p>
       <w:r>
         <w:t>Q4&amp;5: Output</w:t>
       </w:r>
@@ -207,7 +248,7 @@
                     <pic:cNvPicPr/>
                   </pic:nvPicPr>
                   <pic:blipFill>
-                    <a:blip r:embed="rId8"/>
+                    <a:blip r:embed="rId9"/>
                     <a:stretch>
                       <a:fillRect/>
                     </a:stretch>
@@ -229,7 +270,65 @@
       </w:r>
     </w:p>
     <w:p>
-      <w:r>
+      <w:pPr>
+        <w:pStyle w:val="ListParagraph"/>
+        <w:numPr>
+          <w:ilvl w:val="0"/>
+          <w:numId w:val="1"/>
+        </w:numPr>
+        <w:spacing w:before="100" w:beforeAutospacing="1" w:after="100" w:afterAutospacing="1" w:line="240" w:lineRule="auto"/>
+        <w:rPr>
+          <w:rFonts w:ascii="Times New Roman" w:eastAsia="Times New Roman" w:hAnsi="Times New Roman" w:cs="Times New Roman"/>
+          <w:kern w:val="0"/>
+          <w:lang w:val="en-US"/>
+          <w14:ligatures w14:val="none"/>
+        </w:rPr>
+      </w:pPr>
+      <w:r>
+        <w:rPr>
+          <w:rFonts w:ascii="Times New Roman" w:eastAsia="Times New Roman" w:hAnsi="Times New Roman" w:cs="Times New Roman"/>
+          <w:kern w:val="0"/>
+          <w:lang w:val="en-US"/>
+          <w14:ligatures w14:val="none"/>
+        </w:rPr>
+        <w:t>Q4 d</w:t>
+      </w:r>
+      <w:r>
+        <w:rPr>
+          <w:rFonts w:ascii="Times New Roman" w:eastAsia="Times New Roman" w:hAnsi="Times New Roman" w:cs="Times New Roman"/>
+          <w:kern w:val="0"/>
+          <w:lang w:val="en-US"/>
+          <w14:ligatures w14:val="none"/>
+        </w:rPr>
+        <w:t>efines a Student class and initializes values using a constructor</w:t>
+      </w:r>
+      <w:r>
+        <w:rPr>
+          <w:rFonts w:ascii="Times New Roman" w:eastAsia="Times New Roman" w:hAnsi="Times New Roman" w:cs="Times New Roman"/>
+          <w:kern w:val="0"/>
+          <w:lang w:val="en-US"/>
+          <w14:ligatures w14:val="none"/>
+        </w:rPr>
+        <w:t xml:space="preserve"> and Q5 c</w:t>
+      </w:r>
+      <w:r>
+        <w:rPr>
+          <w:rFonts w:ascii="Times New Roman" w:eastAsia="Times New Roman" w:hAnsi="Times New Roman" w:cs="Times New Roman"/>
+          <w:kern w:val="0"/>
+          <w:lang w:val="en-US"/>
+          <w14:ligatures w14:val="none"/>
+        </w:rPr>
+        <w:t>reates a Student object and prints its details.</w:t>
+      </w:r>
+    </w:p>
+    <w:p>
+      <w:pPr>
+        <w:pStyle w:val="ListParagraph"/>
+      </w:pPr>
+    </w:p>
+    <w:p>
+      <w:r>
+        <w:lastRenderedPageBreak/>
         <w:t>Q6: Output</w:t>
       </w:r>
       <w:r>
@@ -252,7 +351,7 @@
                     <pic:cNvPicPr/>
                   </pic:nvPicPr>
                   <pic:blipFill>
-                    <a:blip r:embed="rId9"/>
+                    <a:blip r:embed="rId10"/>
                     <a:stretch>
                       <a:fillRect/>
                     </a:stretch>
@@ -274,8 +373,29 @@
       </w:r>
     </w:p>
     <w:p>
-      <w:r>
-        <w:lastRenderedPageBreak/>
+      <w:pPr>
+        <w:pStyle w:val="ListParagraph"/>
+        <w:numPr>
+          <w:ilvl w:val="0"/>
+          <w:numId w:val="1"/>
+        </w:numPr>
+      </w:pPr>
+      <w:r>
+        <w:t>Defines a Person class with a name and introduce method.</w:t>
+      </w:r>
+    </w:p>
+    <w:p>
+      <w:pPr>
+        <w:pStyle w:val="ListParagraph"/>
+      </w:pPr>
+    </w:p>
+    <w:p>
+      <w:pPr>
+        <w:rPr>
+          <w:noProof/>
+        </w:rPr>
+      </w:pPr>
+      <w:r>
         <w:t>Q7: Output</w:t>
       </w:r>
       <w:r>
@@ -304,7 +424,7 @@
                     <pic:cNvPicPr/>
                   </pic:nvPicPr>
                   <pic:blipFill>
-                    <a:blip r:embed="rId10"/>
+                    <a:blip r:embed="rId11"/>
                     <a:stretch>
                       <a:fillRect/>
                     </a:stretch>
@@ -327,11 +447,24 @@
     </w:p>
     <w:p>
       <w:pPr>
-        <w:rPr>
-          <w:noProof/>
-        </w:rPr>
-      </w:pPr>
-      <w:r>
+        <w:pStyle w:val="ListParagraph"/>
+        <w:numPr>
+          <w:ilvl w:val="0"/>
+          <w:numId w:val="1"/>
+        </w:numPr>
+      </w:pPr>
+      <w:r>
+        <w:t>Uses inheritance so Student can reuse Person’s introduce method.</w:t>
+      </w:r>
+    </w:p>
+    <w:p>
+      <w:pPr>
+        <w:rPr>
+          <w:noProof/>
+        </w:rPr>
+      </w:pPr>
+      <w:r>
+        <w:lastRenderedPageBreak/>
         <w:t>Q8&amp;9: Output</w:t>
       </w:r>
       <w:r>
@@ -360,7 +493,7 @@
                     <pic:cNvPicPr/>
                   </pic:nvPicPr>
                   <pic:blipFill>
-                    <a:blip r:embed="rId11"/>
+                    <a:blip r:embed="rId12"/>
                     <a:stretch>
                       <a:fillRect/>
                     </a:stretch>
@@ -380,6 +513,80 @@
           </wp:inline>
         </w:drawing>
       </w:r>
+    </w:p>
+    <w:p>
+      <w:pPr>
+        <w:pStyle w:val="ListParagraph"/>
+        <w:numPr>
+          <w:ilvl w:val="0"/>
+          <w:numId w:val="1"/>
+        </w:numPr>
+        <w:spacing w:before="100" w:beforeAutospacing="1" w:after="100" w:afterAutospacing="1" w:line="240" w:lineRule="auto"/>
+        <w:rPr>
+          <w:rFonts w:ascii="Times New Roman" w:eastAsia="Times New Roman" w:hAnsi="Times New Roman" w:cs="Times New Roman"/>
+          <w:kern w:val="0"/>
+          <w:lang w:val="en-US"/>
+          <w14:ligatures w14:val="none"/>
+        </w:rPr>
+      </w:pPr>
+      <w:r>
+        <w:rPr>
+          <w:rFonts w:ascii="Times New Roman" w:eastAsia="Times New Roman" w:hAnsi="Times New Roman" w:cs="Times New Roman"/>
+          <w:kern w:val="0"/>
+          <w:lang w:val="en-US"/>
+          <w14:ligatures w14:val="none"/>
+        </w:rPr>
+        <w:t>Q8 d</w:t>
+      </w:r>
+      <w:r>
+        <w:rPr>
+          <w:rFonts w:ascii="Times New Roman" w:eastAsia="Times New Roman" w:hAnsi="Times New Roman" w:cs="Times New Roman"/>
+          <w:kern w:val="0"/>
+          <w:lang w:val="en-US"/>
+          <w14:ligatures w14:val="none"/>
+        </w:rPr>
+        <w:t>efines an interface that enforces course registration</w:t>
+      </w:r>
+      <w:r>
+        <w:rPr>
+          <w:rFonts w:ascii="Times New Roman" w:eastAsia="Times New Roman" w:hAnsi="Times New Roman" w:cs="Times New Roman"/>
+          <w:kern w:val="0"/>
+          <w:lang w:val="en-US"/>
+          <w14:ligatures w14:val="none"/>
+        </w:rPr>
+        <w:t xml:space="preserve"> and Q9 i</w:t>
+      </w:r>
+      <w:r>
+        <w:rPr>
+          <w:rFonts w:ascii="Times New Roman" w:eastAsia="Times New Roman" w:hAnsi="Times New Roman" w:cs="Times New Roman"/>
+          <w:kern w:val="0"/>
+          <w:lang w:val="en-US"/>
+          <w14:ligatures w14:val="none"/>
+        </w:rPr>
+        <w:t>mplements the interface to allow students to register courses.</w:t>
+      </w:r>
+    </w:p>
+    <w:p>
+      <w:pPr>
+        <w:pStyle w:val="ListParagraph"/>
+        <w:rPr>
+          <w:noProof/>
+        </w:rPr>
+      </w:pPr>
+    </w:p>
+    <w:p>
+      <w:pPr>
+        <w:rPr>
+          <w:noProof/>
+        </w:rPr>
+      </w:pPr>
+    </w:p>
+    <w:p>
+      <w:pPr>
+        <w:rPr>
+          <w:noProof/>
+        </w:rPr>
+      </w:pPr>
       <w:r>
         <w:rPr>
           <w:noProof/>
@@ -412,7 +619,7 @@
                     <pic:cNvPicPr/>
                   </pic:nvPicPr>
                   <pic:blipFill>
-                    <a:blip r:embed="rId12"/>
+                    <a:blip r:embed="rId13"/>
                     <a:stretch>
                       <a:fillRect/>
                     </a:stretch>
@@ -434,6 +641,111 @@
       </w:r>
     </w:p>
     <w:p>
+      <w:pPr>
+        <w:pStyle w:val="ListParagraph"/>
+        <w:numPr>
+          <w:ilvl w:val="0"/>
+          <w:numId w:val="1"/>
+        </w:numPr>
+        <w:spacing w:before="100" w:beforeAutospacing="1" w:after="100" w:afterAutospacing="1" w:line="240" w:lineRule="auto"/>
+        <w:rPr>
+          <w:rFonts w:ascii="Times New Roman" w:eastAsia="Times New Roman" w:hAnsi="Times New Roman" w:cs="Times New Roman"/>
+          <w:kern w:val="0"/>
+          <w:lang w:val="en-US"/>
+          <w14:ligatures w14:val="none"/>
+        </w:rPr>
+      </w:pPr>
+      <w:r>
+        <w:rPr>
+          <w:rFonts w:ascii="Times New Roman" w:eastAsia="Times New Roman" w:hAnsi="Times New Roman" w:cs="Times New Roman"/>
+          <w:kern w:val="0"/>
+          <w:lang w:val="en-US"/>
+          <w14:ligatures w14:val="none"/>
+        </w:rPr>
+        <w:t>Q10 c</w:t>
+      </w:r>
+      <w:r>
+        <w:rPr>
+          <w:rFonts w:ascii="Times New Roman" w:eastAsia="Times New Roman" w:hAnsi="Times New Roman" w:cs="Times New Roman"/>
+          <w:kern w:val="0"/>
+          <w:lang w:val="en-US"/>
+          <w14:ligatures w14:val="none"/>
+        </w:rPr>
+        <w:t xml:space="preserve">reates a </w:t>
+      </w:r>
+      <w:proofErr w:type="spellStart"/>
+      <w:r>
+        <w:rPr>
+          <w:rFonts w:ascii="Times New Roman" w:eastAsia="Times New Roman" w:hAnsi="Times New Roman" w:cs="Times New Roman"/>
+          <w:kern w:val="0"/>
+          <w:lang w:val="en-US"/>
+          <w14:ligatures w14:val="none"/>
+        </w:rPr>
+        <w:t>mixin</w:t>
+      </w:r>
+      <w:proofErr w:type="spellEnd"/>
+      <w:r>
+        <w:rPr>
+          <w:rFonts w:ascii="Times New Roman" w:eastAsia="Times New Roman" w:hAnsi="Times New Roman" w:cs="Times New Roman"/>
+          <w:kern w:val="0"/>
+          <w:lang w:val="en-US"/>
+          <w14:ligatures w14:val="none"/>
+        </w:rPr>
+        <w:t xml:space="preserve"> to track student attendance</w:t>
+      </w:r>
+      <w:r>
+        <w:rPr>
+          <w:rFonts w:ascii="Times New Roman" w:eastAsia="Times New Roman" w:hAnsi="Times New Roman" w:cs="Times New Roman"/>
+          <w:kern w:val="0"/>
+          <w:lang w:val="en-US"/>
+          <w14:ligatures w14:val="none"/>
+        </w:rPr>
+        <w:t xml:space="preserve"> and Q11 a</w:t>
+      </w:r>
+      <w:r>
+        <w:rPr>
+          <w:rFonts w:ascii="Times New Roman" w:eastAsia="Times New Roman" w:hAnsi="Times New Roman" w:cs="Times New Roman"/>
+          <w:kern w:val="0"/>
+          <w:lang w:val="en-US"/>
+          <w14:ligatures w14:val="none"/>
+        </w:rPr>
+        <w:t xml:space="preserve">pplies the attendance </w:t>
+      </w:r>
+      <w:proofErr w:type="spellStart"/>
+      <w:r>
+        <w:rPr>
+          <w:rFonts w:ascii="Times New Roman" w:eastAsia="Times New Roman" w:hAnsi="Times New Roman" w:cs="Times New Roman"/>
+          <w:kern w:val="0"/>
+          <w:lang w:val="en-US"/>
+          <w14:ligatures w14:val="none"/>
+        </w:rPr>
+        <w:t>mixin</w:t>
+      </w:r>
+      <w:proofErr w:type="spellEnd"/>
+      <w:r>
+        <w:rPr>
+          <w:rFonts w:ascii="Times New Roman" w:eastAsia="Times New Roman" w:hAnsi="Times New Roman" w:cs="Times New Roman"/>
+          <w:kern w:val="0"/>
+          <w:lang w:val="en-US"/>
+          <w14:ligatures w14:val="none"/>
+        </w:rPr>
+        <w:t xml:space="preserve"> and updates attendance count.</w:t>
+      </w:r>
+    </w:p>
+    <w:p>
+      <w:pPr>
+        <w:pStyle w:val="ListParagraph"/>
+        <w:rPr>
+          <w:noProof/>
+        </w:rPr>
+      </w:pPr>
+    </w:p>
+    <w:p>
+      <w:pPr>
+        <w:rPr>
+          <w:noProof/>
+        </w:rPr>
+      </w:pPr>
       <w:r>
         <w:rPr>
           <w:noProof/>
@@ -467,7 +779,7 @@
                     <pic:cNvPicPr/>
                   </pic:nvPicPr>
                   <pic:blipFill>
-                    <a:blip r:embed="rId13"/>
+                    <a:blip r:embed="rId14"/>
                     <a:stretch>
                       <a:fillRect/>
                     </a:stretch>
@@ -493,6 +805,80 @@
         </w:rPr>
         <w:t xml:space="preserve"> </w:t>
       </w:r>
+    </w:p>
+    <w:p>
+      <w:pPr>
+        <w:pStyle w:val="ListParagraph"/>
+        <w:numPr>
+          <w:ilvl w:val="0"/>
+          <w:numId w:val="1"/>
+        </w:numPr>
+        <w:spacing w:before="100" w:beforeAutospacing="1" w:after="100" w:afterAutospacing="1" w:line="240" w:lineRule="auto"/>
+        <w:rPr>
+          <w:rFonts w:ascii="Times New Roman" w:eastAsia="Times New Roman" w:hAnsi="Times New Roman" w:cs="Times New Roman"/>
+          <w:kern w:val="0"/>
+          <w:lang w:val="en-US"/>
+          <w14:ligatures w14:val="none"/>
+        </w:rPr>
+      </w:pPr>
+      <w:r>
+        <w:rPr>
+          <w:rFonts w:ascii="Times New Roman" w:eastAsia="Times New Roman" w:hAnsi="Times New Roman" w:cs="Times New Roman"/>
+          <w:kern w:val="0"/>
+          <w:lang w:val="en-US"/>
+          <w14:ligatures w14:val="none"/>
+        </w:rPr>
+        <w:t>Q12 s</w:t>
+      </w:r>
+      <w:r>
+        <w:rPr>
+          <w:rFonts w:ascii="Times New Roman" w:eastAsia="Times New Roman" w:hAnsi="Times New Roman" w:cs="Times New Roman"/>
+          <w:kern w:val="0"/>
+          <w:lang w:val="en-US"/>
+          <w14:ligatures w14:val="none"/>
+        </w:rPr>
+        <w:t>tores multiple Student objects in a list</w:t>
+      </w:r>
+      <w:r>
+        <w:rPr>
+          <w:rFonts w:ascii="Times New Roman" w:eastAsia="Times New Roman" w:hAnsi="Times New Roman" w:cs="Times New Roman"/>
+          <w:kern w:val="0"/>
+          <w:lang w:val="en-US"/>
+          <w14:ligatures w14:val="none"/>
+        </w:rPr>
+        <w:t xml:space="preserve"> and Q13 s</w:t>
+      </w:r>
+      <w:r>
+        <w:rPr>
+          <w:rFonts w:ascii="Times New Roman" w:eastAsia="Times New Roman" w:hAnsi="Times New Roman" w:cs="Times New Roman"/>
+          <w:kern w:val="0"/>
+          <w:lang w:val="en-US"/>
+          <w14:ligatures w14:val="none"/>
+        </w:rPr>
+        <w:t>tores students in a map using IDs as keys.</w:t>
+      </w:r>
+    </w:p>
+    <w:p>
+      <w:pPr>
+        <w:pStyle w:val="ListParagraph"/>
+        <w:rPr>
+          <w:noProof/>
+        </w:rPr>
+      </w:pPr>
+    </w:p>
+    <w:p>
+      <w:pPr>
+        <w:rPr>
+          <w:noProof/>
+        </w:rPr>
+      </w:pPr>
+    </w:p>
+    <w:p>
+      <w:pPr>
+        <w:rPr>
+          <w:noProof/>
+        </w:rPr>
+      </w:pPr>
       <w:r>
         <w:rPr>
           <w:noProof/>
@@ -537,7 +923,7 @@
                     <pic:cNvPicPr/>
                   </pic:nvPicPr>
                   <pic:blipFill>
-                    <a:blip r:embed="rId13"/>
+                    <a:blip r:embed="rId14"/>
                     <a:stretch>
                       <a:fillRect/>
                     </a:stretch>
@@ -590,7 +976,7 @@
                     <pic:cNvPicPr/>
                   </pic:nvPicPr>
                   <pic:blipFill>
-                    <a:blip r:embed="rId14"/>
+                    <a:blip r:embed="rId15"/>
                     <a:stretch>
                       <a:fillRect/>
                     </a:stretch>
@@ -613,6 +999,23 @@
     </w:p>
     <w:p>
       <w:pPr>
+        <w:pStyle w:val="ListParagraph"/>
+        <w:numPr>
+          <w:ilvl w:val="0"/>
+          <w:numId w:val="1"/>
+        </w:numPr>
+      </w:pPr>
+      <w:r>
+        <w:t>Uses an anonymous function to print student names.</w:t>
+      </w:r>
+    </w:p>
+    <w:p>
+      <w:pPr>
+        <w:pStyle w:val="ListParagraph"/>
+      </w:pPr>
+    </w:p>
+    <w:p>
+      <w:pPr>
         <w:rPr>
           <w:noProof/>
         </w:rPr>
@@ -649,7 +1052,7 @@
                     <pic:cNvPicPr/>
                   </pic:nvPicPr>
                   <pic:blipFill>
-                    <a:blip r:embed="rId15"/>
+                    <a:blip r:embed="rId16"/>
                     <a:stretch>
                       <a:fillRect/>
                     </a:stretch>
@@ -669,6 +1072,32 @@
           </wp:inline>
         </w:drawing>
       </w:r>
+    </w:p>
+    <w:p>
+      <w:pPr>
+        <w:pStyle w:val="ListParagraph"/>
+        <w:numPr>
+          <w:ilvl w:val="0"/>
+          <w:numId w:val="1"/>
+        </w:numPr>
+        <w:rPr>
+          <w:noProof/>
+        </w:rPr>
+      </w:pPr>
+      <w:r>
+        <w:rPr>
+          <w:noProof/>
+        </w:rPr>
+        <w:t>Uses an arrow function to print a greeting message.</w:t>
+      </w:r>
+    </w:p>
+    <w:p>
+      <w:pPr>
+        <w:pStyle w:val="ListParagraph"/>
+        <w:rPr>
+          <w:noProof/>
+        </w:rPr>
+      </w:pPr>
       <w:r>
         <w:rPr>
           <w:noProof/>
@@ -702,7 +1131,7 @@
                     <pic:cNvPicPr/>
                   </pic:nvPicPr>
                   <pic:blipFill>
-                    <a:blip r:embed="rId16"/>
+                    <a:blip r:embed="rId17"/>
                     <a:stretch>
                       <a:fillRect/>
                     </a:stretch>
@@ -725,6 +1154,70 @@
     </w:p>
     <w:p>
       <w:pPr>
+        <w:pStyle w:val="ListParagraph"/>
+        <w:numPr>
+          <w:ilvl w:val="0"/>
+          <w:numId w:val="1"/>
+        </w:numPr>
+        <w:spacing w:before="100" w:beforeAutospacing="1" w:after="100" w:afterAutospacing="1" w:line="240" w:lineRule="auto"/>
+        <w:rPr>
+          <w:rFonts w:ascii="Times New Roman" w:eastAsia="Times New Roman" w:hAnsi="Times New Roman" w:cs="Times New Roman"/>
+          <w:kern w:val="0"/>
+          <w:lang w:val="en-US"/>
+          <w14:ligatures w14:val="none"/>
+        </w:rPr>
+      </w:pPr>
+      <w:r>
+        <w:rPr>
+          <w:rFonts w:ascii="Times New Roman" w:eastAsia="Times New Roman" w:hAnsi="Times New Roman" w:cs="Times New Roman"/>
+          <w:kern w:val="0"/>
+          <w:lang w:val="en-US"/>
+          <w14:ligatures w14:val="none"/>
+        </w:rPr>
+        <w:t>Q16 l</w:t>
+      </w:r>
+      <w:r>
+        <w:rPr>
+          <w:rFonts w:ascii="Times New Roman" w:eastAsia="Times New Roman" w:hAnsi="Times New Roman" w:cs="Times New Roman"/>
+          <w:kern w:val="0"/>
+          <w:lang w:val="en-US"/>
+          <w14:ligatures w14:val="none"/>
+        </w:rPr>
+        <w:t>oads students asynchronously after a delay</w:t>
+      </w:r>
+      <w:r>
+        <w:rPr>
+          <w:rFonts w:ascii="Times New Roman" w:eastAsia="Times New Roman" w:hAnsi="Times New Roman" w:cs="Times New Roman"/>
+          <w:kern w:val="0"/>
+          <w:lang w:val="en-US"/>
+          <w14:ligatures w14:val="none"/>
+        </w:rPr>
+        <w:t xml:space="preserve"> while Q17 u</w:t>
+      </w:r>
+      <w:r>
+        <w:rPr>
+          <w:rFonts w:ascii="Times New Roman" w:eastAsia="Times New Roman" w:hAnsi="Times New Roman" w:cs="Times New Roman"/>
+          <w:kern w:val="0"/>
+          <w:lang w:val="en-US"/>
+          <w14:ligatures w14:val="none"/>
+        </w:rPr>
+        <w:t>ses await to display the number of loaded students.</w:t>
+      </w:r>
+    </w:p>
+    <w:p>
+      <w:pPr>
+        <w:pStyle w:val="ListParagraph"/>
+        <w:numPr>
+          <w:ilvl w:val="0"/>
+          <w:numId w:val="1"/>
+        </w:numPr>
+        <w:rPr>
+          <w:noProof/>
+        </w:rPr>
+      </w:pPr>
+    </w:p>
+    <w:p>
+      <w:pPr>
         <w:rPr>
           <w:noProof/>
         </w:rPr>
@@ -761,7 +1254,7 @@
                     <pic:cNvPicPr/>
                   </pic:nvPicPr>
                   <pic:blipFill>
-                    <a:blip r:embed="rId17"/>
+                    <a:blip r:embed="rId18"/>
                     <a:stretch>
                       <a:fillRect/>
                     </a:stretch>
@@ -782,6 +1275,24 @@
         </w:drawing>
       </w:r>
     </w:p>
+    <w:p>
+      <w:pPr>
+        <w:pStyle w:val="ListParagraph"/>
+        <w:numPr>
+          <w:ilvl w:val="0"/>
+          <w:numId w:val="2"/>
+        </w:numPr>
+        <w:rPr>
+          <w:noProof/>
+        </w:rPr>
+      </w:pPr>
+      <w:r>
+        <w:rPr>
+          <w:noProof/>
+        </w:rPr>
+        <w:t>Adds notification functionality using a mixin.</w:t>
+      </w:r>
+    </w:p>
     <w:p/>
     <w:sectPr>
       <w:pgSz w:w="11906" w:h="16838"/>
@@ -791,6 +1302,243 @@
     </w:sectPr>
   </w:body>
 </w:document>
+</file>
+
+<file path=word/numbering.xml><?xml version="1.0" encoding="utf-8"?>
+<w:numbering xmlns:wpc="http://schemas.microsoft.com/office/word/2010/wordprocessingCanvas" xmlns:cx="http://schemas.microsoft.com/office/drawing/2014/chartex" xmlns:cx1="http://schemas.microsoft.com/office/drawing/2015/9/8/chartex" xmlns:cx2="http://schemas.microsoft.com/office/drawing/2015/10/21/chartex" xmlns:cx3="http://schemas.microsoft.com/office/drawing/2016/5/9/chartex" xmlns:cx4="http://schemas.microsoft.com/office/drawing/2016/5/10/chartex" xmlns:cx5="http://schemas.microsoft.com/office/drawing/2016/5/11/chartex" xmlns:cx6="http://schemas.microsoft.com/office/drawing/2016/5/12/chartex" xmlns:cx7="http://schemas.microsoft.com/office/drawing/2016/5/13/chartex" xmlns:cx8="http://schemas.microsoft.com/office/drawing/2016/5/14/chartex" xmlns:mc="http://schemas.openxmlformats.org/markup-compatibility/2006" xmlns:aink="http://schemas.microsoft.com/office/drawing/2016/ink" xmlns:am3d="http://schemas.microsoft.com/office/drawing/2017/model3d" xmlns:o="urn:schemas-microsoft-com:office:office" xmlns:oel="http://schemas.microsoft.com/office/2019/extlst" xmlns:r="http://schemas.openxmlformats.org/officeDocument/2006/relationships" xmlns:m="http://schemas.openxmlformats.org/officeDocument/2006/math" xmlns:v="urn:schemas-microsoft-com:vml" xmlns:wp14="http://schemas.microsoft.com/office/word/2010/wordprocessingDrawing" xmlns:wp="http://schemas.openxmlformats.org/drawingml/2006/wordprocessingDrawing" xmlns:w10="urn:schemas-microsoft-com:office:word" xmlns:w="http://schemas.openxmlformats.org/wordprocessingml/2006/main" xmlns:w14="http://schemas.microsoft.com/office/word/2010/wordml" xmlns:w15="http://schemas.microsoft.com/office/word/2012/wordml" xmlns:w16cex="http://schemas.microsoft.com/office/word/2018/wordml/cex" xmlns:w16cid="http://schemas.microsoft.com/office/word/2016/wordml/cid" xmlns:w16="http://schemas.microsoft.com/office/word/2018/wordml" xmlns:w16du="http://schemas.microsoft.com/office/word/2023/wordml/word16du" xmlns:w16sdtdh="http://schemas.microsoft.com/office/word/2020/wordml/sdtdatahash" xmlns:w16sdtfl="http://schemas.microsoft.com/office/word/2024/wordml/sdtformatlock" xmlns:w16se="http://schemas.microsoft.com/office/word/2015/wordml/symex" xmlns:wpg="http://schemas.microsoft.com/office/word/2010/wordprocessingGroup" xmlns:wpi="http://schemas.microsoft.com/office/word/2010/wordprocessingInk" xmlns:wne="http://schemas.microsoft.com/office/word/2006/wordml" xmlns:wps="http://schemas.microsoft.com/office/word/2010/wordprocessingShape" mc:Ignorable="w14 w15 w16se w16cid w16 w16cex w16sdtdh w16sdtfl w16du wp14">
+  <w:abstractNum w:abstractNumId="0" w15:restartNumberingAfterBreak="0">
+    <w:nsid w:val="05E422EE"/>
+    <w:multiLevelType w:val="hybridMultilevel"/>
+    <w:tmpl w:val="534628F0"/>
+    <w:lvl w:ilvl="0" w:tplc="04090009">
+      <w:start w:val="1"/>
+      <w:numFmt w:val="bullet"/>
+      <w:lvlText w:val=""/>
+      <w:lvlJc w:val="left"/>
+      <w:pPr>
+        <w:ind w:left="720" w:hanging="360"/>
+      </w:pPr>
+      <w:rPr>
+        <w:rFonts w:ascii="Wingdings" w:hAnsi="Wingdings" w:hint="default"/>
+      </w:rPr>
+    </w:lvl>
+    <w:lvl w:ilvl="1" w:tplc="04090003" w:tentative="1">
+      <w:start w:val="1"/>
+      <w:numFmt w:val="bullet"/>
+      <w:lvlText w:val="o"/>
+      <w:lvlJc w:val="left"/>
+      <w:pPr>
+        <w:ind w:left="1440" w:hanging="360"/>
+      </w:pPr>
+      <w:rPr>
+        <w:rFonts w:ascii="Courier New" w:hAnsi="Courier New" w:cs="Courier New" w:hint="default"/>
+      </w:rPr>
+    </w:lvl>
+    <w:lvl w:ilvl="2" w:tplc="04090005" w:tentative="1">
+      <w:start w:val="1"/>
+      <w:numFmt w:val="bullet"/>
+      <w:lvlText w:val=""/>
+      <w:lvlJc w:val="left"/>
+      <w:pPr>
+        <w:ind w:left="2160" w:hanging="360"/>
+      </w:pPr>
+      <w:rPr>
+        <w:rFonts w:ascii="Wingdings" w:hAnsi="Wingdings" w:hint="default"/>
+      </w:rPr>
+    </w:lvl>
+    <w:lvl w:ilvl="3" w:tplc="04090001" w:tentative="1">
+      <w:start w:val="1"/>
+      <w:numFmt w:val="bullet"/>
+      <w:lvlText w:val=""/>
+      <w:lvlJc w:val="left"/>
+      <w:pPr>
+        <w:ind w:left="2880" w:hanging="360"/>
+      </w:pPr>
+      <w:rPr>
+        <w:rFonts w:ascii="Symbol" w:hAnsi="Symbol" w:hint="default"/>
+      </w:rPr>
+    </w:lvl>
+    <w:lvl w:ilvl="4" w:tplc="04090003" w:tentative="1">
+      <w:start w:val="1"/>
+      <w:numFmt w:val="bullet"/>
+      <w:lvlText w:val="o"/>
+      <w:lvlJc w:val="left"/>
+      <w:pPr>
+        <w:ind w:left="3600" w:hanging="360"/>
+      </w:pPr>
+      <w:rPr>
+        <w:rFonts w:ascii="Courier New" w:hAnsi="Courier New" w:cs="Courier New" w:hint="default"/>
+      </w:rPr>
+    </w:lvl>
+    <w:lvl w:ilvl="5" w:tplc="04090005" w:tentative="1">
+      <w:start w:val="1"/>
+      <w:numFmt w:val="bullet"/>
+      <w:lvlText w:val=""/>
+      <w:lvlJc w:val="left"/>
+      <w:pPr>
+        <w:ind w:left="4320" w:hanging="360"/>
+      </w:pPr>
+      <w:rPr>
+        <w:rFonts w:ascii="Wingdings" w:hAnsi="Wingdings" w:hint="default"/>
+      </w:rPr>
+    </w:lvl>
+    <w:lvl w:ilvl="6" w:tplc="04090001" w:tentative="1">
+      <w:start w:val="1"/>
+      <w:numFmt w:val="bullet"/>
+      <w:lvlText w:val=""/>
+      <w:lvlJc w:val="left"/>
+      <w:pPr>
+        <w:ind w:left="5040" w:hanging="360"/>
+      </w:pPr>
+      <w:rPr>
+        <w:rFonts w:ascii="Symbol" w:hAnsi="Symbol" w:hint="default"/>
+      </w:rPr>
+    </w:lvl>
+    <w:lvl w:ilvl="7" w:tplc="04090003" w:tentative="1">
+      <w:start w:val="1"/>
+      <w:numFmt w:val="bullet"/>
+      <w:lvlText w:val="o"/>
+      <w:lvlJc w:val="left"/>
+      <w:pPr>
+        <w:ind w:left="5760" w:hanging="360"/>
+      </w:pPr>
+      <w:rPr>
+        <w:rFonts w:ascii="Courier New" w:hAnsi="Courier New" w:cs="Courier New" w:hint="default"/>
+      </w:rPr>
+    </w:lvl>
+    <w:lvl w:ilvl="8" w:tplc="04090005" w:tentative="1">
+      <w:start w:val="1"/>
+      <w:numFmt w:val="bullet"/>
+      <w:lvlText w:val=""/>
+      <w:lvlJc w:val="left"/>
+      <w:pPr>
+        <w:ind w:left="6480" w:hanging="360"/>
+      </w:pPr>
+      <w:rPr>
+        <w:rFonts w:ascii="Wingdings" w:hAnsi="Wingdings" w:hint="default"/>
+      </w:rPr>
+    </w:lvl>
+  </w:abstractNum>
+  <w:abstractNum w:abstractNumId="1" w15:restartNumberingAfterBreak="0">
+    <w:nsid w:val="5CFE487D"/>
+    <w:multiLevelType w:val="hybridMultilevel"/>
+    <w:tmpl w:val="2E6E849A"/>
+    <w:lvl w:ilvl="0" w:tplc="04090009">
+      <w:start w:val="1"/>
+      <w:numFmt w:val="bullet"/>
+      <w:lvlText w:val=""/>
+      <w:lvlJc w:val="left"/>
+      <w:pPr>
+        <w:ind w:left="720" w:hanging="360"/>
+      </w:pPr>
+      <w:rPr>
+        <w:rFonts w:ascii="Wingdings" w:hAnsi="Wingdings" w:hint="default"/>
+      </w:rPr>
+    </w:lvl>
+    <w:lvl w:ilvl="1" w:tplc="04090003" w:tentative="1">
+      <w:start w:val="1"/>
+      <w:numFmt w:val="bullet"/>
+      <w:lvlText w:val="o"/>
+      <w:lvlJc w:val="left"/>
+      <w:pPr>
+        <w:ind w:left="1440" w:hanging="360"/>
+      </w:pPr>
+      <w:rPr>
+        <w:rFonts w:ascii="Courier New" w:hAnsi="Courier New" w:cs="Courier New" w:hint="default"/>
+      </w:rPr>
+    </w:lvl>
+    <w:lvl w:ilvl="2" w:tplc="04090005" w:tentative="1">
+      <w:start w:val="1"/>
+      <w:numFmt w:val="bullet"/>
+      <w:lvlText w:val=""/>
+      <w:lvlJc w:val="left"/>
+      <w:pPr>
+        <w:ind w:left="2160" w:hanging="360"/>
+      </w:pPr>
+      <w:rPr>
+        <w:rFonts w:ascii="Wingdings" w:hAnsi="Wingdings" w:hint="default"/>
+      </w:rPr>
+    </w:lvl>
+    <w:lvl w:ilvl="3" w:tplc="04090001" w:tentative="1">
+      <w:start w:val="1"/>
+      <w:numFmt w:val="bullet"/>
+      <w:lvlText w:val=""/>
+      <w:lvlJc w:val="left"/>
+      <w:pPr>
+        <w:ind w:left="2880" w:hanging="360"/>
+      </w:pPr>
+      <w:rPr>
+        <w:rFonts w:ascii="Symbol" w:hAnsi="Symbol" w:hint="default"/>
+      </w:rPr>
+    </w:lvl>
+    <w:lvl w:ilvl="4" w:tplc="04090003" w:tentative="1">
+      <w:start w:val="1"/>
+      <w:numFmt w:val="bullet"/>
+      <w:lvlText w:val="o"/>
+      <w:lvlJc w:val="left"/>
+      <w:pPr>
+        <w:ind w:left="3600" w:hanging="360"/>
+      </w:pPr>
+      <w:rPr>
+        <w:rFonts w:ascii="Courier New" w:hAnsi="Courier New" w:cs="Courier New" w:hint="default"/>
+      </w:rPr>
+    </w:lvl>
+    <w:lvl w:ilvl="5" w:tplc="04090005" w:tentative="1">
+      <w:start w:val="1"/>
+      <w:numFmt w:val="bullet"/>
+      <w:lvlText w:val=""/>
+      <w:lvlJc w:val="left"/>
+      <w:pPr>
+        <w:ind w:left="4320" w:hanging="360"/>
+      </w:pPr>
+      <w:rPr>
+        <w:rFonts w:ascii="Wingdings" w:hAnsi="Wingdings" w:hint="default"/>
+      </w:rPr>
+    </w:lvl>
+    <w:lvl w:ilvl="6" w:tplc="04090001" w:tentative="1">
+      <w:start w:val="1"/>
+      <w:numFmt w:val="bullet"/>
+      <w:lvlText w:val=""/>
+      <w:lvlJc w:val="left"/>
+      <w:pPr>
+        <w:ind w:left="5040" w:hanging="360"/>
+      </w:pPr>
+      <w:rPr>
+        <w:rFonts w:ascii="Symbol" w:hAnsi="Symbol" w:hint="default"/>
+      </w:rPr>
+    </w:lvl>
+    <w:lvl w:ilvl="7" w:tplc="04090003" w:tentative="1">
+      <w:start w:val="1"/>
+      <w:numFmt w:val="bullet"/>
+      <w:lvlText w:val="o"/>
+      <w:lvlJc w:val="left"/>
+      <w:pPr>
+        <w:ind w:left="5760" w:hanging="360"/>
+      </w:pPr>
+      <w:rPr>
+        <w:rFonts w:ascii="Courier New" w:hAnsi="Courier New" w:cs="Courier New" w:hint="default"/>
+      </w:rPr>
+    </w:lvl>
+    <w:lvl w:ilvl="8" w:tplc="04090005" w:tentative="1">
+      <w:start w:val="1"/>
+      <w:numFmt w:val="bullet"/>
+      <w:lvlText w:val=""/>
+      <w:lvlJc w:val="left"/>
+      <w:pPr>
+        <w:ind w:left="6480" w:hanging="360"/>
+      </w:pPr>
+      <w:rPr>
+        <w:rFonts w:ascii="Wingdings" w:hAnsi="Wingdings" w:hint="default"/>
+      </w:rPr>
+    </w:lvl>
+  </w:abstractNum>
+  <w:num w:numId="1" w16cid:durableId="1559365251">
+    <w:abstractNumId w:val="0"/>
+  </w:num>
+  <w:num w:numId="2" w16cid:durableId="519592561">
+    <w:abstractNumId w:val="1"/>
+  </w:num>
+</w:numbering>
 </file>
 
 <file path=word/styles.xml><?xml version="1.0" encoding="utf-8"?>
@@ -1222,7 +1970,6 @@
     <w:next w:val="Normal"/>
     <w:link w:val="Heading2Char"/>
     <w:uiPriority w:val="9"/>
-    <w:semiHidden/>
     <w:unhideWhenUsed/>
     <w:qFormat/>
     <w:rsid w:val="008021B4"/>
@@ -1397,7 +2144,6 @@
   <w:style w:type="character" w:default="1" w:styleId="DefaultParagraphFont">
     <w:name w:val="Default Paragraph Font"/>
     <w:uiPriority w:val="1"/>
-    <w:semiHidden/>
     <w:unhideWhenUsed/>
   </w:style>
   <w:style w:type="table" w:default="1" w:styleId="TableNormal">
@@ -1439,7 +2185,6 @@
     <w:basedOn w:val="DefaultParagraphFont"/>
     <w:link w:val="Heading2"/>
     <w:uiPriority w:val="9"/>
-    <w:semiHidden/>
     <w:rsid w:val="008021B4"/>
     <w:rPr>
       <w:rFonts w:asciiTheme="majorHAnsi" w:eastAsiaTheme="majorEastAsia" w:hAnsiTheme="majorHAnsi" w:cstheme="majorBidi"/>
@@ -1709,6 +2454,23 @@
       <w:smallCaps/>
       <w:color w:val="0F4761" w:themeColor="accent1" w:themeShade="BF"/>
       <w:spacing w:val="5"/>
+    </w:rPr>
+  </w:style>
+  <w:style w:type="paragraph" w:styleId="NormalWeb">
+    <w:name w:val="Normal (Web)"/>
+    <w:basedOn w:val="Normal"/>
+    <w:uiPriority w:val="99"/>
+    <w:semiHidden/>
+    <w:unhideWhenUsed/>
+    <w:rsid w:val="006F511F"/>
+    <w:pPr>
+      <w:spacing w:before="100" w:beforeAutospacing="1" w:after="100" w:afterAutospacing="1" w:line="240" w:lineRule="auto"/>
+    </w:pPr>
+    <w:rPr>
+      <w:rFonts w:ascii="Times New Roman" w:eastAsia="Times New Roman" w:hAnsi="Times New Roman" w:cs="Times New Roman"/>
+      <w:kern w:val="0"/>
+      <w:lang w:val="en-US"/>
+      <w14:ligatures w14:val="none"/>
     </w:rPr>
   </w:style>
 </w:styles>

</xml_diff>

<commit_message>
Merged the work to fully have one directory with all the work
</commit_message>
<xml_diff>
--- a/outputs/dart_lab-group2.docx
+++ b/outputs/dart_lab-group2.docx
@@ -2,6 +2,25 @@
 <file path=word/document.xml><?xml version="1.0" encoding="utf-8"?>
 <w:document xmlns:wpc="http://schemas.microsoft.com/office/word/2010/wordprocessingCanvas" xmlns:cx="http://schemas.microsoft.com/office/drawing/2014/chartex" xmlns:cx1="http://schemas.microsoft.com/office/drawing/2015/9/8/chartex" xmlns:cx2="http://schemas.microsoft.com/office/drawing/2015/10/21/chartex" xmlns:cx3="http://schemas.microsoft.com/office/drawing/2016/5/9/chartex" xmlns:cx4="http://schemas.microsoft.com/office/drawing/2016/5/10/chartex" xmlns:cx5="http://schemas.microsoft.com/office/drawing/2016/5/11/chartex" xmlns:cx6="http://schemas.microsoft.com/office/drawing/2016/5/12/chartex" xmlns:cx7="http://schemas.microsoft.com/office/drawing/2016/5/13/chartex" xmlns:cx8="http://schemas.microsoft.com/office/drawing/2016/5/14/chartex" xmlns:mc="http://schemas.openxmlformats.org/markup-compatibility/2006" xmlns:aink="http://schemas.microsoft.com/office/drawing/2016/ink" xmlns:am3d="http://schemas.microsoft.com/office/drawing/2017/model3d" xmlns:o="urn:schemas-microsoft-com:office:office" xmlns:oel="http://schemas.microsoft.com/office/2019/extlst" xmlns:r="http://schemas.openxmlformats.org/officeDocument/2006/relationships" xmlns:m="http://schemas.openxmlformats.org/officeDocument/2006/math" xmlns:v="urn:schemas-microsoft-com:vml" xmlns:wp14="http://schemas.microsoft.com/office/word/2010/wordprocessingDrawing" xmlns:wp="http://schemas.openxmlformats.org/drawingml/2006/wordprocessingDrawing" xmlns:w10="urn:schemas-microsoft-com:office:word" xmlns:w="http://schemas.openxmlformats.org/wordprocessingml/2006/main" xmlns:w14="http://schemas.microsoft.com/office/word/2010/wordml" xmlns:w15="http://schemas.microsoft.com/office/word/2012/wordml" xmlns:w16cex="http://schemas.microsoft.com/office/word/2018/wordml/cex" xmlns:w16cid="http://schemas.microsoft.com/office/word/2016/wordml/cid" xmlns:w16="http://schemas.microsoft.com/office/word/2018/wordml" xmlns:w16du="http://schemas.microsoft.com/office/word/2023/wordml/word16du" xmlns:w16sdtdh="http://schemas.microsoft.com/office/word/2020/wordml/sdtdatahash" xmlns:w16sdtfl="http://schemas.microsoft.com/office/word/2024/wordml/sdtformatlock" xmlns:w16se="http://schemas.microsoft.com/office/word/2015/wordml/symex" xmlns:wpg="http://schemas.microsoft.com/office/word/2010/wordprocessingGroup" xmlns:wpi="http://schemas.microsoft.com/office/word/2010/wordprocessingInk" xmlns:wne="http://schemas.microsoft.com/office/word/2006/wordml" xmlns:wps="http://schemas.microsoft.com/office/word/2010/wordprocessingShape" mc:Ignorable="w14 w15 w16se w16cid w16 w16cex w16sdtdh w16sdtfl w16du wp14">
   <w:body>
+    <w:p>
+      <w:pPr>
+        <w:rPr>
+          <w:b/>
+          <w:bCs/>
+          <w:sz w:val="52"/>
+          <w:szCs w:val="52"/>
+        </w:rPr>
+      </w:pPr>
+      <w:r>
+        <w:rPr>
+          <w:b/>
+          <w:bCs/>
+          <w:sz w:val="52"/>
+          <w:szCs w:val="52"/>
+        </w:rPr>
+        <w:t>Outputs Document</w:t>
+      </w:r>
+    </w:p>
     <w:p>
       <w:r>
         <w:t xml:space="preserve">Q1: </w:t>
@@ -31,7 +50,7 @@
                     <pic:cNvPicPr/>
                   </pic:nvPicPr>
                   <pic:blipFill>
-                    <a:blip r:embed="rId4"/>
+                    <a:blip r:embed="rId5"/>
                     <a:stretch>
                       <a:fillRect/>
                     </a:stretch>
@@ -88,7 +107,7 @@
                     <pic:cNvPicPr/>
                   </pic:nvPicPr>
                   <pic:blipFill>
-                    <a:blip r:embed="rId5"/>
+                    <a:blip r:embed="rId6"/>
                     <a:stretch>
                       <a:fillRect/>
                     </a:stretch>
@@ -111,6 +130,7 @@
     </w:p>
     <w:p>
       <w:r>
+        <w:lastRenderedPageBreak/>
         <w:t>Q</w:t>
       </w:r>
       <w:r>
@@ -142,7 +162,7 @@
                     <pic:cNvPicPr/>
                   </pic:nvPicPr>
                   <pic:blipFill>
-                    <a:blip r:embed="rId6"/>
+                    <a:blip r:embed="rId7"/>
                     <a:stretch>
                       <a:fillRect/>
                     </a:stretch>
@@ -165,7 +185,6 @@
     </w:p>
     <w:p>
       <w:r>
-        <w:lastRenderedPageBreak/>
         <w:t>Q4&amp;5: Output</w:t>
       </w:r>
       <w:r>
@@ -188,7 +207,7 @@
                     <pic:cNvPicPr/>
                   </pic:nvPicPr>
                   <pic:blipFill>
-                    <a:blip r:embed="rId7"/>
+                    <a:blip r:embed="rId8"/>
                     <a:stretch>
                       <a:fillRect/>
                     </a:stretch>
@@ -233,7 +252,7 @@
                     <pic:cNvPicPr/>
                   </pic:nvPicPr>
                   <pic:blipFill>
-                    <a:blip r:embed="rId8"/>
+                    <a:blip r:embed="rId9"/>
                     <a:stretch>
                       <a:fillRect/>
                     </a:stretch>
@@ -256,6 +275,7 @@
     </w:p>
     <w:p>
       <w:r>
+        <w:lastRenderedPageBreak/>
         <w:t>Q7: Output</w:t>
       </w:r>
       <w:r>
@@ -284,7 +304,7 @@
                     <pic:cNvPicPr/>
                   </pic:nvPicPr>
                   <pic:blipFill>
-                    <a:blip r:embed="rId9"/>
+                    <a:blip r:embed="rId10"/>
                     <a:stretch>
                       <a:fillRect/>
                     </a:stretch>
@@ -306,15 +326,13 @@
       </w:r>
     </w:p>
     <w:p>
-      <w:r>
-        <w:lastRenderedPageBreak/>
-        <w:t>Q</w:t>
-      </w:r>
-      <w:r>
-        <w:t>8&amp;9</w:t>
-      </w:r>
-      <w:r>
-        <w:t>: Output</w:t>
+      <w:pPr>
+        <w:rPr>
+          <w:noProof/>
+        </w:rPr>
+      </w:pPr>
+      <w:r>
+        <w:t>Q8&amp;9: Output</w:t>
       </w:r>
       <w:r>
         <w:rPr>
@@ -342,7 +360,7 @@
                     <pic:cNvPicPr/>
                   </pic:nvPicPr>
                   <pic:blipFill>
-                    <a:blip r:embed="rId10"/>
+                    <a:blip r:embed="rId11"/>
                     <a:stretch>
                       <a:fillRect/>
                     </a:stretch>
@@ -394,7 +412,7 @@
                     <pic:cNvPicPr/>
                   </pic:nvPicPr>
                   <pic:blipFill>
-                    <a:blip r:embed="rId11"/>
+                    <a:blip r:embed="rId12"/>
                     <a:stretch>
                       <a:fillRect/>
                     </a:stretch>
@@ -415,6 +433,356 @@
         </w:drawing>
       </w:r>
     </w:p>
+    <w:p>
+      <w:r>
+        <w:rPr>
+          <w:noProof/>
+        </w:rPr>
+        <w:lastRenderedPageBreak/>
+        <w:t>Q12 &amp; 13: Output</w:t>
+      </w:r>
+      <w:r>
+        <w:rPr>
+          <w:noProof/>
+        </w:rPr>
+        <w:t xml:space="preserve"> </w:t>
+      </w:r>
+      <w:r>
+        <w:rPr>
+          <w:noProof/>
+        </w:rPr>
+        <w:drawing>
+          <wp:inline distT="0" distB="0" distL="0" distR="0" wp14:anchorId="48F78715" wp14:editId="7F318F65">
+            <wp:extent cx="5731510" cy="2757170"/>
+            <wp:effectExtent l="0" t="0" r="2540" b="5080"/>
+            <wp:docPr id="88008618" name="Picture 1"/>
+            <wp:cNvGraphicFramePr>
+              <a:graphicFrameLocks xmlns:a="http://schemas.openxmlformats.org/drawingml/2006/main" noChangeAspect="1"/>
+            </wp:cNvGraphicFramePr>
+            <a:graphic xmlns:a="http://schemas.openxmlformats.org/drawingml/2006/main">
+              <a:graphicData uri="http://schemas.openxmlformats.org/drawingml/2006/picture">
+                <pic:pic xmlns:pic="http://schemas.openxmlformats.org/drawingml/2006/picture">
+                  <pic:nvPicPr>
+                    <pic:cNvPr id="88008618" name=""/>
+                    <pic:cNvPicPr/>
+                  </pic:nvPicPr>
+                  <pic:blipFill>
+                    <a:blip r:embed="rId13"/>
+                    <a:stretch>
+                      <a:fillRect/>
+                    </a:stretch>
+                  </pic:blipFill>
+                  <pic:spPr>
+                    <a:xfrm>
+                      <a:off x="0" y="0"/>
+                      <a:ext cx="5731510" cy="2757170"/>
+                    </a:xfrm>
+                    <a:prstGeom prst="rect">
+                      <a:avLst/>
+                    </a:prstGeom>
+                  </pic:spPr>
+                </pic:pic>
+              </a:graphicData>
+            </a:graphic>
+          </wp:inline>
+        </w:drawing>
+      </w:r>
+      <w:r>
+        <w:rPr>
+          <w:noProof/>
+        </w:rPr>
+        <w:t xml:space="preserve"> </w:t>
+      </w:r>
+      <w:r>
+        <w:rPr>
+          <w:noProof/>
+        </w:rPr>
+        <w:t>Q14: Output</w:t>
+      </w:r>
+      <w:r>
+        <w:rPr>
+          <w:noProof/>
+        </w:rPr>
+        <w:t xml:space="preserve"> </w:t>
+      </w:r>
+      <w:r>
+        <w:rPr>
+          <w:noProof/>
+        </w:rPr>
+        <w:t>Q12 &amp; 13: Output</w:t>
+      </w:r>
+      <w:r>
+        <w:rPr>
+          <w:noProof/>
+        </w:rPr>
+        <w:t xml:space="preserve"> </w:t>
+      </w:r>
+      <w:r>
+        <w:rPr>
+          <w:noProof/>
+        </w:rPr>
+        <w:drawing>
+          <wp:inline distT="0" distB="0" distL="0" distR="0" wp14:anchorId="26D4C8E5" wp14:editId="4C2BCACA">
+            <wp:extent cx="5731510" cy="2757170"/>
+            <wp:effectExtent l="0" t="0" r="2540" b="5080"/>
+            <wp:docPr id="1616023322" name="Picture 1"/>
+            <wp:cNvGraphicFramePr>
+              <a:graphicFrameLocks xmlns:a="http://schemas.openxmlformats.org/drawingml/2006/main" noChangeAspect="1"/>
+            </wp:cNvGraphicFramePr>
+            <a:graphic xmlns:a="http://schemas.openxmlformats.org/drawingml/2006/main">
+              <a:graphicData uri="http://schemas.openxmlformats.org/drawingml/2006/picture">
+                <pic:pic xmlns:pic="http://schemas.openxmlformats.org/drawingml/2006/picture">
+                  <pic:nvPicPr>
+                    <pic:cNvPr id="88008618" name=""/>
+                    <pic:cNvPicPr/>
+                  </pic:nvPicPr>
+                  <pic:blipFill>
+                    <a:blip r:embed="rId13"/>
+                    <a:stretch>
+                      <a:fillRect/>
+                    </a:stretch>
+                  </pic:blipFill>
+                  <pic:spPr>
+                    <a:xfrm>
+                      <a:off x="0" y="0"/>
+                      <a:ext cx="5731510" cy="2757170"/>
+                    </a:xfrm>
+                    <a:prstGeom prst="rect">
+                      <a:avLst/>
+                    </a:prstGeom>
+                  </pic:spPr>
+                </pic:pic>
+              </a:graphicData>
+            </a:graphic>
+          </wp:inline>
+        </w:drawing>
+      </w:r>
+      <w:r>
+        <w:rPr>
+          <w:noProof/>
+        </w:rPr>
+        <w:t xml:space="preserve"> </w:t>
+      </w:r>
+      <w:r>
+        <w:rPr>
+          <w:noProof/>
+        </w:rPr>
+        <w:lastRenderedPageBreak/>
+        <w:t>Q14: Output</w:t>
+      </w:r>
+      <w:r>
+        <w:rPr>
+          <w:noProof/>
+        </w:rPr>
+        <w:drawing>
+          <wp:inline distT="0" distB="0" distL="0" distR="0" wp14:anchorId="470F79CE" wp14:editId="37C0A62F">
+            <wp:extent cx="5731510" cy="2748915"/>
+            <wp:effectExtent l="0" t="0" r="2540" b="0"/>
+            <wp:docPr id="1632678237" name="Picture 1"/>
+            <wp:cNvGraphicFramePr>
+              <a:graphicFrameLocks xmlns:a="http://schemas.openxmlformats.org/drawingml/2006/main" noChangeAspect="1"/>
+            </wp:cNvGraphicFramePr>
+            <a:graphic xmlns:a="http://schemas.openxmlformats.org/drawingml/2006/main">
+              <a:graphicData uri="http://schemas.openxmlformats.org/drawingml/2006/picture">
+                <pic:pic xmlns:pic="http://schemas.openxmlformats.org/drawingml/2006/picture">
+                  <pic:nvPicPr>
+                    <pic:cNvPr id="334470776" name=""/>
+                    <pic:cNvPicPr/>
+                  </pic:nvPicPr>
+                  <pic:blipFill>
+                    <a:blip r:embed="rId14"/>
+                    <a:stretch>
+                      <a:fillRect/>
+                    </a:stretch>
+                  </pic:blipFill>
+                  <pic:spPr>
+                    <a:xfrm>
+                      <a:off x="0" y="0"/>
+                      <a:ext cx="5731510" cy="2748915"/>
+                    </a:xfrm>
+                    <a:prstGeom prst="rect">
+                      <a:avLst/>
+                    </a:prstGeom>
+                  </pic:spPr>
+                </pic:pic>
+              </a:graphicData>
+            </a:graphic>
+          </wp:inline>
+        </w:drawing>
+      </w:r>
+    </w:p>
+    <w:p>
+      <w:pPr>
+        <w:rPr>
+          <w:noProof/>
+        </w:rPr>
+      </w:pPr>
+      <w:r>
+        <w:rPr>
+          <w:noProof/>
+        </w:rPr>
+        <w:t>Q15: Output</w:t>
+      </w:r>
+      <w:r>
+        <w:rPr>
+          <w:noProof/>
+        </w:rPr>
+        <w:t xml:space="preserve"> </w:t>
+      </w:r>
+      <w:r>
+        <w:rPr>
+          <w:noProof/>
+        </w:rPr>
+        <w:drawing>
+          <wp:inline distT="0" distB="0" distL="0" distR="0" wp14:anchorId="418B52D8" wp14:editId="06B23366">
+            <wp:extent cx="5731510" cy="2849880"/>
+            <wp:effectExtent l="0" t="0" r="2540" b="7620"/>
+            <wp:docPr id="1521086056" name="Picture 1"/>
+            <wp:cNvGraphicFramePr>
+              <a:graphicFrameLocks xmlns:a="http://schemas.openxmlformats.org/drawingml/2006/main" noChangeAspect="1"/>
+            </wp:cNvGraphicFramePr>
+            <a:graphic xmlns:a="http://schemas.openxmlformats.org/drawingml/2006/main">
+              <a:graphicData uri="http://schemas.openxmlformats.org/drawingml/2006/picture">
+                <pic:pic xmlns:pic="http://schemas.openxmlformats.org/drawingml/2006/picture">
+                  <pic:nvPicPr>
+                    <pic:cNvPr id="1521086056" name=""/>
+                    <pic:cNvPicPr/>
+                  </pic:nvPicPr>
+                  <pic:blipFill>
+                    <a:blip r:embed="rId15"/>
+                    <a:stretch>
+                      <a:fillRect/>
+                    </a:stretch>
+                  </pic:blipFill>
+                  <pic:spPr>
+                    <a:xfrm>
+                      <a:off x="0" y="0"/>
+                      <a:ext cx="5731510" cy="2849880"/>
+                    </a:xfrm>
+                    <a:prstGeom prst="rect">
+                      <a:avLst/>
+                    </a:prstGeom>
+                  </pic:spPr>
+                </pic:pic>
+              </a:graphicData>
+            </a:graphic>
+          </wp:inline>
+        </w:drawing>
+      </w:r>
+      <w:r>
+        <w:rPr>
+          <w:noProof/>
+        </w:rPr>
+        <w:lastRenderedPageBreak/>
+        <w:t>Q16&amp;17: Output</w:t>
+      </w:r>
+      <w:r>
+        <w:rPr>
+          <w:noProof/>
+        </w:rPr>
+        <w:t xml:space="preserve"> </w:t>
+      </w:r>
+      <w:r>
+        <w:rPr>
+          <w:noProof/>
+        </w:rPr>
+        <w:drawing>
+          <wp:inline distT="0" distB="0" distL="0" distR="0" wp14:anchorId="7CE1EE75" wp14:editId="43FB2732">
+            <wp:extent cx="5731510" cy="2797175"/>
+            <wp:effectExtent l="0" t="0" r="2540" b="3175"/>
+            <wp:docPr id="142502959" name="Picture 1"/>
+            <wp:cNvGraphicFramePr>
+              <a:graphicFrameLocks xmlns:a="http://schemas.openxmlformats.org/drawingml/2006/main" noChangeAspect="1"/>
+            </wp:cNvGraphicFramePr>
+            <a:graphic xmlns:a="http://schemas.openxmlformats.org/drawingml/2006/main">
+              <a:graphicData uri="http://schemas.openxmlformats.org/drawingml/2006/picture">
+                <pic:pic xmlns:pic="http://schemas.openxmlformats.org/drawingml/2006/picture">
+                  <pic:nvPicPr>
+                    <pic:cNvPr id="142502959" name=""/>
+                    <pic:cNvPicPr/>
+                  </pic:nvPicPr>
+                  <pic:blipFill>
+                    <a:blip r:embed="rId16"/>
+                    <a:stretch>
+                      <a:fillRect/>
+                    </a:stretch>
+                  </pic:blipFill>
+                  <pic:spPr>
+                    <a:xfrm>
+                      <a:off x="0" y="0"/>
+                      <a:ext cx="5731510" cy="2797175"/>
+                    </a:xfrm>
+                    <a:prstGeom prst="rect">
+                      <a:avLst/>
+                    </a:prstGeom>
+                  </pic:spPr>
+                </pic:pic>
+              </a:graphicData>
+            </a:graphic>
+          </wp:inline>
+        </w:drawing>
+      </w:r>
+    </w:p>
+    <w:p>
+      <w:pPr>
+        <w:rPr>
+          <w:noProof/>
+        </w:rPr>
+      </w:pPr>
+      <w:r>
+        <w:rPr>
+          <w:noProof/>
+        </w:rPr>
+        <w:t>Q19: Output</w:t>
+      </w:r>
+      <w:r>
+        <w:rPr>
+          <w:noProof/>
+        </w:rPr>
+        <w:t xml:space="preserve"> </w:t>
+      </w:r>
+      <w:r>
+        <w:rPr>
+          <w:noProof/>
+        </w:rPr>
+        <w:drawing>
+          <wp:inline distT="0" distB="0" distL="0" distR="0" wp14:anchorId="41DB8963" wp14:editId="5E0FC09D">
+            <wp:extent cx="5731510" cy="2958465"/>
+            <wp:effectExtent l="0" t="0" r="2540" b="0"/>
+            <wp:docPr id="1972879032" name="Picture 1"/>
+            <wp:cNvGraphicFramePr>
+              <a:graphicFrameLocks xmlns:a="http://schemas.openxmlformats.org/drawingml/2006/main" noChangeAspect="1"/>
+            </wp:cNvGraphicFramePr>
+            <a:graphic xmlns:a="http://schemas.openxmlformats.org/drawingml/2006/main">
+              <a:graphicData uri="http://schemas.openxmlformats.org/drawingml/2006/picture">
+                <pic:pic xmlns:pic="http://schemas.openxmlformats.org/drawingml/2006/picture">
+                  <pic:nvPicPr>
+                    <pic:cNvPr id="1972879032" name=""/>
+                    <pic:cNvPicPr/>
+                  </pic:nvPicPr>
+                  <pic:blipFill>
+                    <a:blip r:embed="rId17"/>
+                    <a:stretch>
+                      <a:fillRect/>
+                    </a:stretch>
+                  </pic:blipFill>
+                  <pic:spPr>
+                    <a:xfrm>
+                      <a:off x="0" y="0"/>
+                      <a:ext cx="5731510" cy="2958465"/>
+                    </a:xfrm>
+                    <a:prstGeom prst="rect">
+                      <a:avLst/>
+                    </a:prstGeom>
+                  </pic:spPr>
+                </pic:pic>
+              </a:graphicData>
+            </a:graphic>
+          </wp:inline>
+        </w:drawing>
+      </w:r>
+    </w:p>
+    <w:p/>
     <w:sectPr>
       <w:pgSz w:w="11906" w:h="16838"/>
       <w:pgMar w:top="1440" w:right="1440" w:bottom="1440" w:left="1440" w:header="708" w:footer="708" w:gutter="0"/>
@@ -1659,4 +2027,16 @@
     </a:ext>
   </a:extLst>
 </a:theme>
+</file>
+
+<file path=customXml/item1.xml><?xml version="1.0" encoding="utf-8"?>
+<b:Sources xmlns:b="http://schemas.openxmlformats.org/officeDocument/2006/bibliography" xmlns="http://schemas.openxmlformats.org/officeDocument/2006/bibliography" SelectedStyle="\APASixthEditionOfficeOnline.xsl" StyleName="APA" Version="6"/>
+</file>
+
+<file path=customXml/itemProps1.xml><?xml version="1.0" encoding="utf-8"?>
+<ds:datastoreItem xmlns:ds="http://schemas.openxmlformats.org/officeDocument/2006/customXml" ds:itemID="{A42A3F9D-A0CE-42A2-94EC-6DB6B73ECBAF}">
+  <ds:schemaRefs>
+    <ds:schemaRef ds:uri="http://schemas.openxmlformats.org/officeDocument/2006/bibliography"/>
+  </ds:schemaRefs>
+</ds:datastoreItem>
 </file>
</xml_diff>